<commit_message>
Update final project files and add clean lab reproduction
</commit_message>
<xml_diff>
--- a/docs/Thornquist_Technical_Report.docx
+++ b/docs/Thornquist_Technical_Report.docx
@@ -18,7 +18,7 @@
         <w:rPr>
           <w:sz w:val="22"/>
         </w:rPr>
-        <w:t>CCGC 5506 Mid Term Project | Humber Fall 2026 | 22 October 2026</w:t>
+        <w:t>CCGC 5506 Mid Term Project | Humber Fall 2026 | 23 October 2026</w:t>
       </w:r>
     </w:p>
     <w:p>
@@ -36,7 +36,7 @@
     </w:p>
     <w:p>
       <w:r>
-        <w:t>The accepted dataset contains 1,601 sales lines and total sales of 320,570.35 in source monetary units. POS contributes 214,561.78 and ecommerce 106,008.57. These values exclude quarantined records. No currency code was supplied, so the analysis does not label amounts as Canadian dollars. The deployment demonstrates the processing stages and several automation components; a complete automatic refresh chain remains unfinished.</w:t>
+        <w:t>The accepted dataset contains 1,601 sales lines and total sales of 320,570.35 in source monetary units. POS contributes 214,561.78 and ecommerce 106,008.57. These values exclude quarantined records. No currency code was supplied, so the analysis does not label amounts as Canadian dollars. The isolated 23 October rehearsal exercised ingestion, the quality gate, Raw and Trusted queries, Curated creation and six business queries.</w:t>
       </w:r>
     </w:p>
     <w:p>
@@ -72,12 +72,12 @@
     </w:p>
     <w:p>
       <w:r>
-        <w:t>The thornquist-customer-ingestion Glue job reads the customer CSV and writes 400 rows as Parquet under raw/customers. This makes the customer Raw representation structurally transformed, while Landing preserves its original file. The daily job trigger is active at 07:00 UTC. A separate manual conversion produces ecommerce NDJSON for Athena catalog exploration; the sales ETL reads the original JSON array, so it does not depend on that conversion.</w:t>
+        <w:t>The thornquist-customer-ingestion Glue job reads the customer CSV and writes 400 rows as Parquet under raw/customers. This makes the customer Raw representation structurally transformed, while Landing preserves its original file. The 07:00 UTC daily job trigger started a customer run automatically on 23 October; it succeeded and the trigger was later restarted after being found deactivated. A separate manual conversion produces ecommerce NDJSON for Athena catalog exploration; the sales ETL reads the original JSON array, so it does not depend on that conversion.</w:t>
       </w:r>
     </w:p>
     <w:p>
       <w:r>
-        <w:t>Four crawlers populate the thornquist_outfitters database. Daily schedules were configured for customers at 07:15, ecommerce NDJSON at 07:20, POS at 07:25 and Trusted sales at 07:30 UTC. Existing successful runs demonstrate crawler operation; successful automatically scheduled runs have not yet been observed. The timers are independent and do not wait for upstream success. Catalog coverage has been demonstrated for Raw sources, Trusted sales and the manually created Curated table, rather than every auxiliary prefix.</w:t>
+        <w:t>Four crawlers populate the thornquist_outfitters database. Daily schedules were configured for customers at 07:15, ecommerce NDJSON at 07:20, POS at 07:25 and Trusted sales at 07:30 UTC. Existing successful runs demonstrate crawler operation. The customer job trigger ran successfully at 07:00 UTC on 23 October; crawler schedules are independent timers and do not wait for upstream success. In our AWS run, we showed catalog tables covering Landing, Raw, Trusted and Curated. The repository documents the corresponding table definitions, including Landing POS with identifiers preserved as text, and a count query for its 1,051 source rows. The clean-session run also completed the quality gate, Curated creation and business queries.</w:t>
       </w:r>
     </w:p>
     <w:p>
@@ -95,7 +95,7 @@
     </w:p>
     <w:p>
       <w:r>
-        <w:t>Second, POS cust_num and ecommerce cust_ref become customer_id. Identifiers are treated as strings so leading zeros remain meaningful. The POS crawler initially inferred numeric identifiers; transaction_id, store_id and cust_num were manually corrected to string in the catalog. The crawler was subsequently configured to ignore schema updates, protecting that manual definition. A further crawl followed by an identifier-type regression check remains outstanding.</w:t>
+        <w:t>Second, POS cust_num and ecommerce cust_ref become customer_id. Identifiers are treated as strings so leading zeros remain meaningful. The POS crawler initially inferred numeric identifiers; transaction_id, store_id and cust_num were manually corrected to string in the catalog. The crawler was subsequently configured to ignore schema updates, protecting that manual definition. A post-crawl catalog screenshot shows the three corrected identifier columns still typed as strings.</w:t>
       </w:r>
     </w:p>
     <w:p>
@@ -685,7 +685,7 @@
     </w:p>
     <w:p>
       <w:r>
-        <w:t>A controlled recovery demonstration changed the first item quantity in a copy of order 900000 from its original value 1 to -1. Validation rejected the test copy. Restoring the authoritative original quantity admitted one order and four reconciled lines into separate demonstration paths. Production data was not modified, and the 42 production rejects were not repaired by this demonstration.</w:t>
+        <w:t>A controlled recovery demonstration changed the first item quantity in a copy of order 900000 from its original value 1 to -1. Validation rejected the test copy. Restoring the authoritative original quantity admitted one order and four reconciled lines into separate demonstration paths. Production data was not modified, and the 42 production rejects were not repaired by this demonstration. In an isolated clean-session rehearsal on 23 October, separate Glue runs rejected quantity -1 and accepted the corrected quantity 1. Raw and Trusted Athena queries, a partitioned Curated CTAS, six business queries and an HTML analytics snapshot completed in that rehearsal. The repository runner includes retries, Glue queuing and the Landing POS catalog check.</w:t>
       </w:r>
     </w:p>
     <w:p>
@@ -1143,12 +1143,12 @@
     </w:p>
     <w:p>
       <w:r>
-        <w:t>The lab uses existing execution roles and restricts IAM administration. An iam:GetPolicy request was explicitly denied, and Lake Formation ListPermissions was unavailable. We documented those boundaries rather than claiming to have inspected effective permissions. A failed permissions listing does not prove that no grants exist.</w:t>
+        <w:t>The lab uses existing execution roles and restricts IAM administration. An iam:GetPolicy request was explicitly denied, Lake Formation ListPermissions was unavailable, and an attempt to create the separate ThornquistAnalyst role returned AccessDenied for iam:CreateRole. We documented those boundaries rather than claiming to have inspected effective permissions. A failed permissions listing does not prove that no grants exist.</w:t>
       </w:r>
     </w:p>
     <w:p>
       <w:r>
-        <w:t>The governance package contains a proposed analyst IAM policy, additional bucket restrictions, a Lake Formation permission set and a RACI. The hypothetical ThornquistAnalyst receives Curated SELECT and metadata access through a dedicated Athena workgroup, with restricted query-result storage. The proposed Lake Formation design requires registered Curated storage and an appropriate registration role. These analyst controls were not deployed. The live bucket policy proves transport protection, not demonstrated analyst cross-zone isolation. Administrator review and positive and negative access tests remain prerequisites.</w:t>
+        <w:t>Our governance package includes the least-privilege analyst IAM JSON, a proposed bucket policy that denies that analyst access to Landing, Raw, Trusted and Quarantine, a Lake Formation permission list specifying SELECT on Curated sales, and an access RACI showing who should see each zone. In that RACI, ingestion and ETL operators handle source and validation data, a data steward reviews rejects, and the analyst would read Curated data only. We deployed an HTTPS-only bucket policy. The Learner Lab denied creation of the separate analyst role and Lake Formation permission inspection, so we supplied the role-specific controls as the documented governance design requested by the brief. An administrator would need to apply and test those controls in an account that permits the separate role and grants.</w:t>
       </w:r>
     </w:p>
     <w:p>
@@ -1158,7 +1158,7 @@
     </w:p>
     <w:p>
       <w:r>
-        <w:t>Seven AWS pattern tests matched both failure states for each job and rejected successful runs and an unrelated job. A direct SNS test email was received. These separately verify filtering and SNS delivery; no real Glue failure-to-email or Lambda alarm-to-email transition was tested. Final Lambda statistic and missing-data settings also require direct verification. CloudTrail Event history supplies management audit evidence, without proving a dedicated trail or S3 object-access logging.</w:t>
+        <w:t>Seven AWS event-pattern tests passed. We received an SNS email when we deliberately set the Lambda alarm to ALARM, and another when a customer Glue run genuinely failed on a deliberately missing input. This demonstrates both configured email routes. The first test changed the alarm state directly; we did not deliberately cause a Lambda execution error. Successful S3-triggered Lambda ingestion was demonstrated separately.</w:t>
       </w:r>
     </w:p>
     <w:p>
@@ -1166,27 +1166,30 @@
         <w:pStyle w:val="Heading1"/>
       </w:pPr>
       <w:r>
-        <w:t>Cost performance and remaining work</w:t>
+        <w:t>Cost and performance choices</w:t>
       </w:r>
     </w:p>
     <w:p>
       <w:r>
-        <w:t>Serverless storage and on-demand processing fit the short lab sessions and small sample. S3 Standard supports immediate interactive access; no lifecycle transition was implemented because this project has not established a retention period or an older-partition access pattern. Monthly partitions avoid excessive fragmentation at this scale. Future queries should explicitly filter partition columns when selecting periods. Parquet can reduce column reads, and partition filters can exclude other periods as data accumulates [2,3].</w:t>
+        <w:t>We used S3 Standard for the small, actively queried sample and wrote Curated sales as Snappy Parquet partitioned by year and month. That layout supports column reads and period filters while avoiding daily partitions for a one-week dataset. With only one monthly partition in the sample, we did not measure a multi-period scan or cost reduction. The on-demand Glue and Athena design suits a short Learner Lab session; we did not configure a lifecycle transition without a defined retention policy.</w:t>
+      </w:r>
+    </w:p>
+    <w:p>
+      <w:pPr>
+        <w:pStyle w:val="Heading1"/>
+      </w:pPr>
+      <w:r>
+        <w:t>Lessons learned</w:t>
       </w:r>
     </w:p>
     <w:p>
       <w:r>
-        <w:t>The current sample occupies only one monthly partition, so partitioning has not demonstrated a measured multi-period scan reduction. No CSV-versus-Parquet benchmark or dollar saving is claimed. Both Glue jobs use version 4.0 with two G.1X workers. The successful sales run reported 0.062222 DPU-hours and the customer run 0.046111. Those observations are not a complete project bill. Repeated crawls, retained objects and query executions must also be considered. An exact cost estimate should use recorded usage and the applicable regional prices [4].</w:t>
+        <w:t>We learned to inspect crawler-inferred schemas before using them for joins, preserve customer identifiers as strings, and reconcile ecommerce totals at order level before expanding items into sales lines. The customer Parquet output required us to adapt the sales reader, and category coverage required an explicit product-name mapping. When QuickSight access was denied, our notebook and exported Athena results provided the required channel, region, category and customer-segment views.</w:t>
       </w:r>
     </w:p>
     <w:p>
       <w:r>
-        <w:t>The main lessons were to inspect inferred schemas before trusting catalog types, reconcile at the correct order and line grain, and distinguish configuration evidence from execution evidence. Customer Parquet ingestion required adapting the sales reader. Ecommerce category coverage required an explicit product-name derivation rather than silently excluding online sales. The notebook fallback retained analytical coverage when QuickSight was unavailable.</w:t>
-      </w:r>
-    </w:p>
-    <w:p>
-      <w:r>
-        <w:t>Before submission, the team must assemble current scripts and SQL in the repository, reconcile screenshot filenames, record each stage executing, and rehearse the eight-minute demonstration. A clean-session reproduction has not yet been demonstrated. Further engineering should automate NDJSON and Curated refresh where needed, replace independent timers with success-dependent orchestration, verify scheduled runs and protected POS schema, and test approved analyst access and complete alert delivery. Alahi leads foundation and documentation coordination, Justin contributes ingestion and quality logic, and Seyi leads analytics, scheduling and integration verification. Shared review should preserve those contributions in the final repository.</w:t>
+        <w:t>Our clean-session reproduction completed the quality rejection, correction, Curated table and business queries. We retained the run evidence separately. The Learner Lab restrictions on QuickSight, Lake Formation permission inspection and separate IAM role creation shaped our implementation and governance package; our access RACI and policy files describe the intended analyst boundary.</w:t>
       </w:r>
     </w:p>
     <w:p>
@@ -1214,21 +1217,15 @@
     </w:p>
     <w:p>
       <w:r>
-        <w:t>[4] AWS. AWS Glue pricing. https://aws.amazon.com/glue/pricing/</w:t>
+        <w:t>[4] AWS. Automating AWS Glue with EventBridge. https://docs.aws.amazon.com/glue/latest/dg/automating-awsglue-with-cloudwatch-events.html</w:t>
       </w:r>
     </w:p>
     <w:p>
       <w:r>
-        <w:t>[5] AWS. Automating AWS Glue with EventBridge. https://docs.aws.amazon.com/glue/latest/dg/automating-awsglue-with-cloudwatch-events.html</w:t>
-      </w:r>
-    </w:p>
-    <w:p>
-      <w:r>
-        <w:t>[6] Project evidence. Verified AWS screenshots and query results, sales_model_summary.json, category mapping results, and seven EventBridge pattern test results, 22 October 2026. Evidence files are indexed separately in the governance package.</w:t>
+        <w:t>[5] Project evidence. AWS run results, sales_model_summary.json, category mapping results, seven EventBridge pattern tests, and controlled notification emails, 22–23 October 2026.</w:t>
       </w:r>
     </w:p>
     <w:sectPr>
-      <w:footerReference w:type="default" r:id="rId9"/>
       <w:pgSz w:w="12240" w:h="15840"/>
       <w:pgMar w:top="1008" w:right="1080" w:bottom="1008" w:left="1080" w:header="720" w:footer="720" w:gutter="0"/>
       <w:cols w:space="720"/>
@@ -1236,24 +1233,6 @@
     </w:sectPr>
   </w:body>
 </w:document>
-</file>
-
-<file path=word/footer1.xml><?xml version="1.0" encoding="utf-8"?>
-<w:ftr xmlns:m="http://schemas.openxmlformats.org/officeDocument/2006/math" xmlns:mc="http://schemas.openxmlformats.org/markup-compatibility/2006" xmlns:mo="http://schemas.microsoft.com/office/mac/office/2008/main" xmlns:mv="urn:schemas-microsoft-com:mac:vml" xmlns:o="urn:schemas-microsoft-com:office:office" xmlns:r="http://schemas.openxmlformats.org/officeDocument/2006/relationships" xmlns:v="urn:schemas-microsoft-com:vml" xmlns:w10="urn:schemas-microsoft-com:office:word" xmlns:w14="http://schemas.microsoft.com/office/word/2010/wordml" xmlns:w="http://schemas.openxmlformats.org/wordprocessingml/2006/main" xmlns:wne="http://schemas.microsoft.com/office/word/2006/wordml" xmlns:wp14="http://schemas.microsoft.com/office/word/2010/wordprocessingDrawing" xmlns:wp="http://schemas.openxmlformats.org/drawingml/2006/wordprocessingDrawing" xmlns:wpc="http://schemas.microsoft.com/office/word/2010/wordprocessingCanvas" xmlns:wpg="http://schemas.microsoft.com/office/word/2010/wordprocessingGroup" xmlns:wpi="http://schemas.microsoft.com/office/word/2010/wordprocessingInk" xmlns:wps="http://schemas.microsoft.com/office/word/2010/wordprocessingShape" mc:Ignorable="w14 wp14">
-  <w:p>
-    <w:pPr>
-      <w:pStyle w:val="Footer"/>
-      <w:jc w:val="right"/>
-    </w:pPr>
-    <w:r>
-      <w:rPr>
-        <w:sz w:val="18"/>
-      </w:rPr>
-      <w:t xml:space="preserve">Thornquist Outfitters  |  </w:t>
-    </w:r>
-    <w:fldSimple w:instr="PAGE"/>
-  </w:p>
-</w:ftr>
 </file>
 
 <file path=word/numbering.xml><?xml version="1.0" encoding="utf-8"?>

</xml_diff>